<commit_message>
AL-202 update ibrahima's AL-19 test case and AL-5 use case now that #60 is merged
</commit_message>
<xml_diff>
--- a/docs/sprint-1-submission/ibrahima/AL-19/test-case.docx
+++ b/docs/sprint-1-submission/ibrahima/AL-19/test-case.docx
@@ -233,7 +233,7 @@
               <w:rPr>
                 <w:sz w:val="19"/>
               </w:rPr>
-              <w:t>al-mobile/AgenticLender/Affordability on branch main (form and endpoint call); the result screen is PR #60, repository CS3-Agentic-Lender/agentic-lender</w:t>
+              <w:t>al-mobile/AgenticLender/Affordability on branch main (form, endpoint call and, since PR #60 merged on 22 Oct, the result screen), repository CS3-Agentic-Lender/agentic-lender</w:t>
             </w:r>
           </w:p>
         </w:tc>
@@ -339,7 +339,7 @@
         <w:pStyle w:val="ListBullet"/>
       </w:pPr>
       <w:r>
-        <w:t>Unit test results on 22 Oct 2026: 192 tests on the PR #60 branch with main merged in, 0 failures.</w:t>
+        <w:t>Unit test results on 22 Oct 2026: 192 tests on PR #60 just before it merged into main, 0 failures.</w:t>
       </w:r>
     </w:p>
     <w:p>
@@ -527,7 +527,7 @@
               <w:rPr>
                 <w:sz w:val="19"/>
               </w:rPr>
-              <w:t>Automated (PR #60 branch): AffordabilitySummaryTests &gt; testReferenceCaseOneSingleFirstTimeBuyer, testIncomeLimitIsThreeAndAHalfTimesForOtherBuyers; AffordabilityResultTests &gt; testDecodesEachLimit (main). Simulator: case 1 showed €240,000, €1,145.80 and "Limited by income (4x income)". Pass on the branch.</w:t>
+              <w:t>Automated: AffordabilitySummaryTests &gt; testReferenceCaseOneSingleFirstTimeBuyer, testIncomeLimitIsThreeAndAHalfTimesForOtherBuyers; AffordabilityResultTests &gt; testDecodesEachLimit. Simulator: case 1 showed €240,000, €1,145.80 and "Limited by income (4x income)". Pass (on main).</w:t>
             </w:r>
           </w:p>
         </w:tc>
@@ -594,7 +594,7 @@
               <w:rPr>
                 <w:sz w:val="19"/>
               </w:rPr>
-              <w:t>Automated: AffordabilitySummaryTests &gt; testReferenceCaseTwoJointMoversLimitedByDeposit, testCaseThreeLimitedByDebtsRoundsTheLoanToTheEuro (PR #60 branch); AffordabilityResultTests &gt; testDecodesTheReferenceCaseOneResponse, testJointRequestSendsOneHouseholdIncome (main). Real endpoint (13 Oct): POST /ai/affordability returned 200 with max loan 240,000 and the app showed it. Simulator: case 3 showed €166,792 and €796.29. Pass on the branch.</w:t>
+              <w:t>Automated: AffordabilitySummaryTests &gt; testReferenceCaseTwoJointMoversLimitedByDeposit, testCaseThreeLimitedByDebtsRoundsTheLoanToTheEuro; AffordabilityResultTests &gt; testDecodesTheReferenceCaseOneResponse, testJointRequestSendsOneHouseholdIncome. Real endpoint (13 Oct): POST /ai/affordability returned 200 with max loan 240,000 and the app showed it. Simulator: case 3 showed €166,792 and €796.29. Pass (on main).</w:t>
             </w:r>
           </w:p>
         </w:tc>
@@ -661,7 +661,7 @@
               <w:rPr>
                 <w:sz w:val="19"/>
               </w:rPr>
-              <w:t>Automated: AffordabilitySummaryTests &gt; testRateNoteShowsTheRateWithItsMonthAndSaysItIsIndicative, testAnUnreadableRateDateIsShownAsSent. Pass on the branch.</w:t>
+              <w:t>Automated: AffordabilitySummaryTests &gt; testRateNoteShowsTheRateWithItsMonthAndSaysItIsIndicative, testAnUnreadableRateDateIsShownAsSent. Pass (on main).</w:t>
             </w:r>
           </w:p>
         </w:tc>
@@ -882,15 +882,7 @@
         <w:pStyle w:val="ListBullet"/>
       </w:pPr>
       <w:r>
-        <w:t>The result screen (AL-97, PR #60) is in review; it is up to date with main and only needs an approval.</w:t>
-      </w:r>
-    </w:p>
-    <w:p>
-      <w:pPr>
-        <w:pStyle w:val="ListBullet"/>
-      </w:pPr>
-      <w:r>
-        <w:t>Start application (TC-19-05) comes with the application form, PR #61, which follows #60.</w:t>
+        <w:t>Start application (TC-19-05) comes with the application form, PR #61, which is being rebuilt from main now that #60 is merged.</w:t>
       </w:r>
     </w:p>
     <w:p>
@@ -922,7 +914,7 @@
         <w:pStyle w:val="ListBullet"/>
       </w:pPr>
       <w:r>
-        <w:t>Pull requests: #53 (form) and #59 (endpoint call) are merged; #60 (result) is in review.</w:t>
+        <w:t>Pull requests: #53 (form), #59 (endpoint call) and #60 (result screen, 22 Oct) are merged.</w:t>
       </w:r>
     </w:p>
     <w:p>

</xml_diff>